<commit_message>
Style site like NVIDIA AMRI: white/gray sections, York-red links, hero logo+text, day/night toggle, circular member photos, Join Us! page
</commit_message>
<xml_diff>
--- a/content/prospective/index.docx
+++ b/content/prospective/index.docx
@@ -7,13 +7,13 @@
         <w:pStyle w:val="Title"/>
       </w:pPr>
       <w:r>
-        <w:t xml:space="preserve">Prospective</w:t>
+        <w:t xml:space="preserve">Join</w:t>
       </w:r>
       <w:r>
         <w:t xml:space="preserve"> </w:t>
       </w:r>
       <w:r>
-        <w:t xml:space="preserve">Students</w:t>
+        <w:t xml:space="preserve">Us!</w:t>
       </w:r>
     </w:p>
     <w:p>

</xml_diff>